<commit_message>
Sesube cambios faltantes del proyecto
</commit_message>
<xml_diff>
--- a/Nombre del Proyecto.docx
+++ b/Nombre del Proyecto.docx
@@ -29,25 +29,7 @@
           <w:sz w:val="32"/>
           <w:szCs w:val="32"/>
         </w:rPr>
-        <w:t>Nombre del Proyecto</w:t>
-      </w:r>
-      <w:r>
-        <w:rPr>
-          <w:b/>
-          <w:bCs/>
-          <w:sz w:val="32"/>
-          <w:szCs w:val="32"/>
-        </w:rPr>
-        <w:t xml:space="preserve">: </w:t>
-      </w:r>
-      <w:r>
-        <w:rPr>
-          <w:b/>
-          <w:bCs/>
-          <w:sz w:val="32"/>
-          <w:szCs w:val="32"/>
-        </w:rPr>
-        <w:t>Sistema de Órdenes de Mantenimiento</w:t>
+        <w:t>Nombre del Proyecto: Sistema de Órdenes de Mantenimiento</w:t>
       </w:r>
     </w:p>
     <w:p>
@@ -189,16 +171,7 @@
           <w:sz w:val="32"/>
           <w:szCs w:val="32"/>
         </w:rPr>
-        <w:t>Versión</w:t>
-      </w:r>
-      <w:r>
-        <w:rPr>
-          <w:b/>
-          <w:bCs/>
-          <w:sz w:val="32"/>
-          <w:szCs w:val="32"/>
-        </w:rPr>
-        <w:t>:</w:t>
+        <w:t>Versión:</w:t>
       </w:r>
       <w:r>
         <w:rPr>
@@ -405,23 +378,28 @@
           <w:sz w:val="24"/>
           <w:szCs w:val="24"/>
         </w:rPr>
-        <w:t>Qué hace el sistema</w:t>
+        <w:t xml:space="preserve">Qué hace el sistema: </w:t>
       </w:r>
       <w:r>
         <w:rPr>
-          <w:b/>
-          <w:bCs/>
-          <w:sz w:val="24"/>
-          <w:szCs w:val="24"/>
-        </w:rPr>
-        <w:t xml:space="preserve">: </w:t>
+          <w:sz w:val="24"/>
+          <w:szCs w:val="24"/>
+        </w:rPr>
+        <w:t>El sistema administra órdenes de mantenimiento mediante un inicio de sesión para el administrador. Permite recibir órdenes desde otra plataforma</w:t>
       </w:r>
       <w:r>
         <w:rPr>
           <w:sz w:val="24"/>
           <w:szCs w:val="24"/>
         </w:rPr>
-        <w:t>El sistema administra órdenes de mantenimiento mediante un inicio de sesión para el administrador. Permite recibir órdenes desde otra plataforma, crear nuevas órdenes, asignarlas o reasignarlas a técnicos, actualizar información y consultar órdenes finalizadas.</w:t>
+        <w:t xml:space="preserve"> llamada (Intranet)</w:t>
+      </w:r>
+      <w:r>
+        <w:rPr>
+          <w:sz w:val="24"/>
+          <w:szCs w:val="24"/>
+        </w:rPr>
+        <w:t>, crear nuevas órdenes, asignarlas o reasignarlas a técnicos, actualizar información y consultar órdenes finalizadas.</w:t>
       </w:r>
     </w:p>
     <w:p>
@@ -484,23 +462,7 @@
           <w:sz w:val="24"/>
           <w:szCs w:val="24"/>
         </w:rPr>
-        <w:t xml:space="preserve">También existen problemas en la organización del </w:t>
-      </w:r>
-      <w:proofErr w:type="spellStart"/>
-      <w:r>
-        <w:rPr>
-          <w:sz w:val="24"/>
-          <w:szCs w:val="24"/>
-        </w:rPr>
-        <w:t>backend</w:t>
-      </w:r>
-      <w:proofErr w:type="spellEnd"/>
-      <w:r>
-        <w:rPr>
-          <w:sz w:val="24"/>
-          <w:szCs w:val="24"/>
-        </w:rPr>
-        <w:t>, ya que gran parte de la lógica se encuentra concentrada en los controladores, dificultando agregar nuevas funciones o realizar cambios sin afectar otras partes del sistema.</w:t>
+        <w:t>También existen problemas en la organización del backend, ya que gran parte de la lógica se encuentra concentrada en los controladores, dificultando agregar nuevas funciones o realizar cambios sin afectar otras partes del sistema.</w:t>
       </w:r>
     </w:p>
     <w:p>
@@ -569,39 +531,7 @@
           <w:sz w:val="24"/>
           <w:szCs w:val="24"/>
         </w:rPr>
-        <w:t xml:space="preserve">Para ello, se implementarán tecnologías más actuales y estables, utilizando Angular 21 y Laravel 12, trabajando bajo una arquitectura más limpia y organizada basada en </w:t>
-      </w:r>
-      <w:proofErr w:type="spellStart"/>
-      <w:r>
-        <w:rPr>
-          <w:sz w:val="24"/>
-          <w:szCs w:val="24"/>
-        </w:rPr>
-        <w:t>Layered</w:t>
-      </w:r>
-      <w:proofErr w:type="spellEnd"/>
-      <w:r>
-        <w:rPr>
-          <w:sz w:val="24"/>
-          <w:szCs w:val="24"/>
-        </w:rPr>
-        <w:t xml:space="preserve"> </w:t>
-      </w:r>
-      <w:proofErr w:type="spellStart"/>
-      <w:r>
-        <w:rPr>
-          <w:sz w:val="24"/>
-          <w:szCs w:val="24"/>
-        </w:rPr>
-        <w:t>Architecture</w:t>
-      </w:r>
-      <w:proofErr w:type="spellEnd"/>
-      <w:r>
-        <w:rPr>
-          <w:sz w:val="24"/>
-          <w:szCs w:val="24"/>
-        </w:rPr>
-        <w:t>. Asimismo, se diseñará una base de datos MySQL optimizada y escalable, junto con librerías de interfaz modernas que permitan mejorar el rendimiento y la experiencia del usuario.</w:t>
+        <w:t>Para ello, se implementarán tecnologías más actuales y estables, utilizando Angular 21 y Laravel 12, trabajando bajo una arquitectura más limpia y organizada basada en Layered Architecture. Asimismo, se diseñará una base de datos MySQL optimizada y escalable, junto con librerías de interfaz modernas que permitan mejorar el rendimiento y la experiencia del usuario.</w:t>
       </w:r>
     </w:p>
     <w:p>
@@ -637,39 +567,7 @@
           <w:sz w:val="24"/>
           <w:szCs w:val="24"/>
         </w:rPr>
-        <w:t xml:space="preserve">La migración contempla la actualización completa del sistema, incluyendo </w:t>
-      </w:r>
-      <w:proofErr w:type="spellStart"/>
-      <w:r>
-        <w:rPr>
-          <w:sz w:val="24"/>
-          <w:szCs w:val="24"/>
-        </w:rPr>
-        <w:t>frontend</w:t>
-      </w:r>
-      <w:proofErr w:type="spellEnd"/>
-      <w:r>
-        <w:rPr>
-          <w:sz w:val="24"/>
-          <w:szCs w:val="24"/>
-        </w:rPr>
-        <w:t xml:space="preserve">, </w:t>
-      </w:r>
-      <w:proofErr w:type="spellStart"/>
-      <w:r>
-        <w:rPr>
-          <w:sz w:val="24"/>
-          <w:szCs w:val="24"/>
-        </w:rPr>
-        <w:t>backend</w:t>
-      </w:r>
-      <w:proofErr w:type="spellEnd"/>
-      <w:r>
-        <w:rPr>
-          <w:sz w:val="24"/>
-          <w:szCs w:val="24"/>
-        </w:rPr>
-        <w:t xml:space="preserve"> y base de datos. También abarca la mejora de la estructura del código, optimización de procesos, actualización tecnológica y rediseño de la interfaz, manteniendo las funcionalidades principales del sistema de órdenes de mantenimiento y permitiendo futuras mejoras y nuevas funcionalidades.</w:t>
+        <w:t>La migración contempla la actualización completa del sistema, incluyendo frontend, backend y base de datos. También abarca la mejora de la estructura del código, optimización de procesos, actualización tecnológica y rediseño de la interfaz, manteniendo las funcionalidades principales del sistema de órdenes de mantenimiento y permitiendo futuras mejoras y nuevas funcionalidades.</w:t>
       </w:r>
     </w:p>
     <w:p>
@@ -759,24 +657,6 @@
           <w:tab w:val="left" w:pos="990"/>
         </w:tabs>
         <w:rPr>
-          <w:sz w:val="24"/>
-          <w:szCs w:val="24"/>
-        </w:rPr>
-      </w:pPr>
-      <w:r>
-        <w:rPr>
-          <w:sz w:val="24"/>
-          <w:szCs w:val="24"/>
-        </w:rPr>
-        <w:t>Debido a estas limitaciones, se plantea migrar hacia una arquitectura más limpia y modular que permita una mejor organización del código, mayor mantenibilidad y facilidad de crecimiento del sistema.</w:t>
-      </w:r>
-    </w:p>
-    <w:p>
-      <w:pPr>
-        <w:tabs>
-          <w:tab w:val="left" w:pos="990"/>
-        </w:tabs>
-        <w:rPr>
           <w:b/>
           <w:bCs/>
           <w:sz w:val="24"/>
@@ -805,7 +685,6 @@
           <w:szCs w:val="24"/>
         </w:rPr>
       </w:pPr>
-      <w:proofErr w:type="spellStart"/>
       <w:r>
         <w:rPr>
           <w:b/>
@@ -815,7 +694,6 @@
         </w:rPr>
         <w:t>Frontend</w:t>
       </w:r>
-      <w:proofErr w:type="spellEnd"/>
     </w:p>
     <w:tbl>
       <w:tblPr>
@@ -1051,7 +929,6 @@
                 <w:szCs w:val="24"/>
               </w:rPr>
             </w:pPr>
-            <w:proofErr w:type="spellStart"/>
             <w:r>
               <w:rPr>
                 <w:color w:val="000000" w:themeColor="text1"/>
@@ -1060,7 +937,6 @@
               </w:rPr>
               <w:t>Boostrap</w:t>
             </w:r>
-            <w:proofErr w:type="spellEnd"/>
             <w:r>
               <w:rPr>
                 <w:color w:val="000000" w:themeColor="text1"/>
@@ -1163,7 +1039,7 @@
                 <w:szCs w:val="24"/>
                 <w:lang w:val="en-US"/>
               </w:rPr>
-              <w:t xml:space="preserve">Laravel </w:t>
+              <w:t>Laravel Mix,</w:t>
             </w:r>
             <w:r>
               <w:rPr>
@@ -1172,7 +1048,7 @@
                 <w:szCs w:val="24"/>
                 <w:lang w:val="en-US"/>
               </w:rPr>
-              <w:t>Mix,</w:t>
+              <w:t xml:space="preserve"> </w:t>
             </w:r>
             <w:r>
               <w:rPr>
@@ -1181,9 +1057,8 @@
                 <w:szCs w:val="24"/>
                 <w:lang w:val="en-US"/>
               </w:rPr>
-              <w:t xml:space="preserve"> </w:t>
-            </w:r>
-            <w:proofErr w:type="spellStart"/>
+              <w:t>Lodash</w:t>
+            </w:r>
             <w:r>
               <w:rPr>
                 <w:color w:val="000000" w:themeColor="text1"/>
@@ -1191,9 +1066,8 @@
                 <w:szCs w:val="24"/>
                 <w:lang w:val="en-US"/>
               </w:rPr>
-              <w:t>Lodash</w:t>
-            </w:r>
-            <w:proofErr w:type="spellEnd"/>
+              <w:t xml:space="preserve">, </w:t>
+            </w:r>
             <w:r>
               <w:rPr>
                 <w:color w:val="000000" w:themeColor="text1"/>
@@ -1201,6 +1075,15 @@
                 <w:szCs w:val="24"/>
                 <w:lang w:val="en-US"/>
               </w:rPr>
+              <w:t>Popper.js</w:t>
+            </w:r>
+            <w:r>
+              <w:rPr>
+                <w:color w:val="000000" w:themeColor="text1"/>
+                <w:sz w:val="24"/>
+                <w:szCs w:val="24"/>
+                <w:lang w:val="en-US"/>
+              </w:rPr>
               <w:t xml:space="preserve">, </w:t>
             </w:r>
             <w:r>
@@ -1210,7 +1093,7 @@
                 <w:szCs w:val="24"/>
                 <w:lang w:val="en-US"/>
               </w:rPr>
-              <w:t>Popper.js</w:t>
+              <w:t>Resolve-url-loader</w:t>
             </w:r>
             <w:r>
               <w:rPr>
@@ -1228,103 +1111,37 @@
                 <w:szCs w:val="24"/>
                 <w:lang w:val="en-US"/>
               </w:rPr>
-              <w:t>Resolve-</w:t>
-            </w:r>
-            <w:proofErr w:type="spellStart"/>
-            <w:r>
+              <w:t xml:space="preserve">Sass </w:t>
+            </w:r>
+          </w:p>
+          <w:p>
+            <w:pPr>
+              <w:tabs>
+                <w:tab w:val="left" w:pos="990"/>
+              </w:tabs>
+              <w:cnfStyle w:val="000000000000" w:firstRow="0" w:lastRow="0" w:firstColumn="0" w:lastColumn="0" w:oddVBand="0" w:evenVBand="0" w:oddHBand="0" w:evenHBand="0" w:firstRowFirstColumn="0" w:firstRowLastColumn="0" w:lastRowFirstColumn="0" w:lastRowLastColumn="0"/>
               <w:rPr>
                 <w:color w:val="000000" w:themeColor="text1"/>
                 <w:sz w:val="24"/>
                 <w:szCs w:val="24"/>
                 <w:lang w:val="en-US"/>
               </w:rPr>
-              <w:t>url</w:t>
-            </w:r>
-            <w:proofErr w:type="spellEnd"/>
+            </w:pPr>
             <w:r>
               <w:rPr>
                 <w:color w:val="000000" w:themeColor="text1"/>
                 <w:sz w:val="24"/>
                 <w:szCs w:val="24"/>
-                <w:lang w:val="en-US"/>
-              </w:rPr>
-              <w:t>-loader</w:t>
+              </w:rPr>
+              <w:t xml:space="preserve">Sass-loader </w:t>
             </w:r>
             <w:r>
               <w:rPr>
                 <w:color w:val="000000" w:themeColor="text1"/>
                 <w:sz w:val="24"/>
                 <w:szCs w:val="24"/>
-                <w:lang w:val="en-US"/>
               </w:rPr>
               <w:t xml:space="preserve">, </w:t>
-            </w:r>
-            <w:r>
-              <w:rPr>
-                <w:color w:val="000000" w:themeColor="text1"/>
-                <w:sz w:val="24"/>
-                <w:szCs w:val="24"/>
-                <w:lang w:val="en-US"/>
-              </w:rPr>
-              <w:t xml:space="preserve">Sass </w:t>
-            </w:r>
-          </w:p>
-          <w:p>
-            <w:pPr>
-              <w:tabs>
-                <w:tab w:val="left" w:pos="990"/>
-              </w:tabs>
-              <w:cnfStyle w:val="000000000000" w:firstRow="0" w:lastRow="0" w:firstColumn="0" w:lastColumn="0" w:oddVBand="0" w:evenVBand="0" w:oddHBand="0" w:evenHBand="0" w:firstRowFirstColumn="0" w:firstRowLastColumn="0" w:lastRowFirstColumn="0" w:lastRowLastColumn="0"/>
-              <w:rPr>
-                <w:color w:val="000000" w:themeColor="text1"/>
-                <w:sz w:val="24"/>
-                <w:szCs w:val="24"/>
-                <w:lang w:val="en-US"/>
-              </w:rPr>
-            </w:pPr>
-            <w:r>
-              <w:rPr>
-                <w:color w:val="000000" w:themeColor="text1"/>
-                <w:sz w:val="24"/>
-                <w:szCs w:val="24"/>
-              </w:rPr>
-              <w:t>Sass-</w:t>
-            </w:r>
-            <w:proofErr w:type="spellStart"/>
-            <w:proofErr w:type="gramStart"/>
-            <w:r>
-              <w:rPr>
-                <w:color w:val="000000" w:themeColor="text1"/>
-                <w:sz w:val="24"/>
-                <w:szCs w:val="24"/>
-              </w:rPr>
-              <w:t>loader</w:t>
-            </w:r>
-            <w:proofErr w:type="spellEnd"/>
-            <w:r>
-              <w:rPr>
-                <w:color w:val="000000" w:themeColor="text1"/>
-                <w:sz w:val="24"/>
-                <w:szCs w:val="24"/>
-              </w:rPr>
-              <w:t xml:space="preserve"> </w:t>
-            </w:r>
-            <w:r>
-              <w:rPr>
-                <w:color w:val="000000" w:themeColor="text1"/>
-                <w:sz w:val="24"/>
-                <w:szCs w:val="24"/>
-              </w:rPr>
-              <w:t>,</w:t>
-            </w:r>
-            <w:proofErr w:type="gramEnd"/>
-            <w:r>
-              <w:rPr>
-                <w:color w:val="000000" w:themeColor="text1"/>
-                <w:sz w:val="24"/>
-                <w:szCs w:val="24"/>
-              </w:rPr>
-              <w:t xml:space="preserve"> </w:t>
             </w:r>
             <w:r>
               <w:rPr>
@@ -1968,7 +1785,6 @@
                 <w:szCs w:val="24"/>
               </w:rPr>
             </w:pPr>
-            <w:proofErr w:type="spellStart"/>
             <w:r>
               <w:rPr>
                 <w:color w:val="000000" w:themeColor="text1"/>
@@ -1977,7 +1793,6 @@
               </w:rPr>
               <w:t>Eloquent</w:t>
             </w:r>
-            <w:proofErr w:type="spellEnd"/>
           </w:p>
         </w:tc>
       </w:tr>
@@ -2001,7 +1816,6 @@
           <w:sz w:val="24"/>
           <w:szCs w:val="24"/>
         </w:rPr>
-        <w:lastRenderedPageBreak/>
         <w:t>Infraestructura</w:t>
       </w:r>
     </w:p>
@@ -2161,6 +1975,7 @@
                 <w:sz w:val="24"/>
                 <w:szCs w:val="24"/>
               </w:rPr>
+              <w:lastRenderedPageBreak/>
               <w:t>Base de Datos</w:t>
             </w:r>
           </w:p>
@@ -2359,39 +2174,7 @@
           <w:sz w:val="24"/>
           <w:szCs w:val="24"/>
         </w:rPr>
-        <w:t xml:space="preserve">La nueva arquitectura del sistema estará basada en una estructura más limpia, modular y escalable, utilizando </w:t>
-      </w:r>
-      <w:proofErr w:type="spellStart"/>
-      <w:r>
-        <w:rPr>
-          <w:sz w:val="24"/>
-          <w:szCs w:val="24"/>
-        </w:rPr>
-        <w:t>Layered</w:t>
-      </w:r>
-      <w:proofErr w:type="spellEnd"/>
-      <w:r>
-        <w:rPr>
-          <w:sz w:val="24"/>
-          <w:szCs w:val="24"/>
-        </w:rPr>
-        <w:t xml:space="preserve"> </w:t>
-      </w:r>
-      <w:proofErr w:type="spellStart"/>
-      <w:r>
-        <w:rPr>
-          <w:sz w:val="24"/>
-          <w:szCs w:val="24"/>
-        </w:rPr>
-        <w:t>Architecture</w:t>
-      </w:r>
-      <w:proofErr w:type="spellEnd"/>
-      <w:r>
-        <w:rPr>
-          <w:sz w:val="24"/>
-          <w:szCs w:val="24"/>
-        </w:rPr>
-        <w:t xml:space="preserve"> para separar correctamente las responsabilidades de cada componente del sistema.</w:t>
+        <w:t>La nueva arquitectura del sistema estará basada en una estructura más limpia, modular y escalable, utilizando Layered Architecture para separar correctamente las responsabilidades de cada componente del sistema.</w:t>
       </w:r>
     </w:p>
     <w:p>
@@ -2409,39 +2192,7 @@
           <w:sz w:val="24"/>
           <w:szCs w:val="24"/>
         </w:rPr>
-        <w:t xml:space="preserve">El </w:t>
-      </w:r>
-      <w:proofErr w:type="spellStart"/>
-      <w:r>
-        <w:rPr>
-          <w:sz w:val="24"/>
-          <w:szCs w:val="24"/>
-        </w:rPr>
-        <w:t>frontend</w:t>
-      </w:r>
-      <w:proofErr w:type="spellEnd"/>
-      <w:r>
-        <w:rPr>
-          <w:sz w:val="24"/>
-          <w:szCs w:val="24"/>
-        </w:rPr>
-        <w:t xml:space="preserve"> será desarrollado con Angular 21, permitiendo una interfaz más moderna, dinámica y mantenible. El </w:t>
-      </w:r>
-      <w:proofErr w:type="spellStart"/>
-      <w:r>
-        <w:rPr>
-          <w:sz w:val="24"/>
-          <w:szCs w:val="24"/>
-        </w:rPr>
-        <w:t>backend</w:t>
-      </w:r>
-      <w:proofErr w:type="spellEnd"/>
-      <w:r>
-        <w:rPr>
-          <w:sz w:val="24"/>
-          <w:szCs w:val="24"/>
-        </w:rPr>
-        <w:t xml:space="preserve"> será construido con Laravel 12, implementando una mejor organización de la lógica de negocio, servicios y controladores.</w:t>
+        <w:t>El frontend será desarrollado con Angular 21, permitiendo una interfaz más moderna, dinámica y mantenible. El backend será construido con Laravel 12, implementando una mejor organización de la lógica de negocio, servicios y controladores.</w:t>
       </w:r>
     </w:p>
     <w:p>
@@ -2574,7 +2325,6 @@
                 <w:szCs w:val="24"/>
               </w:rPr>
             </w:pPr>
-            <w:proofErr w:type="spellStart"/>
             <w:r>
               <w:rPr>
                 <w:b w:val="0"/>
@@ -2584,7 +2334,6 @@
               </w:rPr>
               <w:t>Frontend</w:t>
             </w:r>
-            <w:proofErr w:type="spellEnd"/>
           </w:p>
         </w:tc>
         <w:tc>
@@ -2654,7 +2403,6 @@
                 <w:szCs w:val="24"/>
               </w:rPr>
             </w:pPr>
-            <w:proofErr w:type="spellStart"/>
             <w:r>
               <w:rPr>
                 <w:b w:val="0"/>
@@ -2664,7 +2412,6 @@
               </w:rPr>
               <w:t>Backend</w:t>
             </w:r>
-            <w:proofErr w:type="spellEnd"/>
           </w:p>
         </w:tc>
         <w:tc>
@@ -2737,7 +2484,7 @@
               <w:tblLook w:val="04A0" w:firstRow="1" w:lastRow="0" w:firstColumn="1" w:lastColumn="0" w:noHBand="0" w:noVBand="1"/>
             </w:tblPr>
             <w:tblGrid>
-              <w:gridCol w:w="1984"/>
+              <w:gridCol w:w="2082"/>
             </w:tblGrid>
             <w:tr>
               <w:trPr>
@@ -2745,7 +2492,7 @@
               </w:trPr>
               <w:tc>
                 <w:tcPr>
-                  <w:tcW w:w="0" w:type="auto"/>
+                  <w:tcW w:w="2022" w:type="dxa"/>
                   <w:vAlign w:val="center"/>
                   <w:hideMark/>
                 </w:tcPr>
@@ -2978,17 +2725,8 @@
                 <w:sz w:val="24"/>
                 <w:szCs w:val="24"/>
               </w:rPr>
-              <w:t xml:space="preserve">Layered </w:t>
-            </w:r>
-            <w:proofErr w:type="spellStart"/>
-            <w:r>
-              <w:rPr>
-                <w:sz w:val="24"/>
-                <w:szCs w:val="24"/>
-              </w:rPr>
-              <w:t>Architecture</w:t>
-            </w:r>
-            <w:proofErr w:type="spellEnd"/>
+              <w:t>Layered Architecture</w:t>
+            </w:r>
           </w:p>
         </w:tc>
       </w:tr>
@@ -3098,104 +2836,93 @@
                 <w:sz w:val="24"/>
                 <w:szCs w:val="24"/>
               </w:rPr>
-              <w:t xml:space="preserve">Lenguaje </w:t>
-            </w:r>
-            <w:proofErr w:type="spellStart"/>
-            <w:r>
+              <w:t>Lenguaje Backend</w:t>
+            </w:r>
+          </w:p>
+        </w:tc>
+        <w:tc>
+          <w:tcPr>
+            <w:tcW w:w="2943" w:type="dxa"/>
+          </w:tcPr>
+          <w:p>
+            <w:pPr>
+              <w:tabs>
+                <w:tab w:val="left" w:pos="990"/>
+              </w:tabs>
+              <w:cnfStyle w:val="000000100000" w:firstRow="0" w:lastRow="0" w:firstColumn="0" w:lastColumn="0" w:oddVBand="0" w:evenVBand="0" w:oddHBand="1" w:evenHBand="0" w:firstRowFirstColumn="0" w:firstRowLastColumn="0" w:lastRowFirstColumn="0" w:lastRowLastColumn="0"/>
+              <w:rPr>
+                <w:sz w:val="24"/>
+                <w:szCs w:val="24"/>
+              </w:rPr>
+            </w:pPr>
+            <w:r>
+              <w:rPr>
+                <w:sz w:val="24"/>
+                <w:szCs w:val="24"/>
+              </w:rPr>
+              <w:t>PHP 7.2.5</w:t>
+            </w:r>
+          </w:p>
+        </w:tc>
+        <w:tc>
+          <w:tcPr>
+            <w:tcW w:w="2943" w:type="dxa"/>
+          </w:tcPr>
+          <w:p>
+            <w:pPr>
+              <w:tabs>
+                <w:tab w:val="left" w:pos="990"/>
+              </w:tabs>
+              <w:cnfStyle w:val="000000100000" w:firstRow="0" w:lastRow="0" w:firstColumn="0" w:lastColumn="0" w:oddVBand="0" w:evenVBand="0" w:oddHBand="1" w:evenHBand="0" w:firstRowFirstColumn="0" w:firstRowLastColumn="0" w:lastRowFirstColumn="0" w:lastRowLastColumn="0"/>
+              <w:rPr>
+                <w:b/>
+                <w:bCs/>
+                <w:sz w:val="24"/>
+                <w:szCs w:val="24"/>
+              </w:rPr>
+            </w:pPr>
+            <w:r>
+              <w:rPr>
+                <w:sz w:val="24"/>
+                <w:szCs w:val="24"/>
+              </w:rPr>
+              <w:t xml:space="preserve">PHP </w:t>
+            </w:r>
+            <w:r>
+              <w:rPr>
+                <w:sz w:val="24"/>
+                <w:szCs w:val="24"/>
+              </w:rPr>
+              <w:t>8.2.12</w:t>
+            </w:r>
+          </w:p>
+        </w:tc>
+      </w:tr>
+      <w:tr>
+        <w:tc>
+          <w:tcPr>
+            <w:cnfStyle w:val="001000000000" w:firstRow="0" w:lastRow="0" w:firstColumn="1" w:lastColumn="0" w:oddVBand="0" w:evenVBand="0" w:oddHBand="0" w:evenHBand="0" w:firstRowFirstColumn="0" w:firstRowLastColumn="0" w:lastRowFirstColumn="0" w:lastRowLastColumn="0"/>
+            <w:tcW w:w="2942" w:type="dxa"/>
+          </w:tcPr>
+          <w:p>
+            <w:pPr>
+              <w:tabs>
+                <w:tab w:val="left" w:pos="990"/>
+              </w:tabs>
               <w:rPr>
                 <w:b w:val="0"/>
                 <w:bCs w:val="0"/>
                 <w:sz w:val="24"/>
                 <w:szCs w:val="24"/>
               </w:rPr>
-              <w:t>Backend</w:t>
-            </w:r>
-            <w:proofErr w:type="spellEnd"/>
-          </w:p>
-        </w:tc>
-        <w:tc>
-          <w:tcPr>
-            <w:tcW w:w="2943" w:type="dxa"/>
-          </w:tcPr>
-          <w:p>
-            <w:pPr>
-              <w:tabs>
-                <w:tab w:val="left" w:pos="990"/>
-              </w:tabs>
-              <w:cnfStyle w:val="000000100000" w:firstRow="0" w:lastRow="0" w:firstColumn="0" w:lastColumn="0" w:oddVBand="0" w:evenVBand="0" w:oddHBand="1" w:evenHBand="0" w:firstRowFirstColumn="0" w:firstRowLastColumn="0" w:lastRowFirstColumn="0" w:lastRowLastColumn="0"/>
-              <w:rPr>
-                <w:sz w:val="24"/>
-                <w:szCs w:val="24"/>
-              </w:rPr>
-            </w:pPr>
-            <w:r>
-              <w:rPr>
-                <w:sz w:val="24"/>
-                <w:szCs w:val="24"/>
-              </w:rPr>
-              <w:t>PHP 7.2.5</w:t>
-            </w:r>
-          </w:p>
-        </w:tc>
-        <w:tc>
-          <w:tcPr>
-            <w:tcW w:w="2943" w:type="dxa"/>
-          </w:tcPr>
-          <w:p>
-            <w:pPr>
-              <w:tabs>
-                <w:tab w:val="left" w:pos="990"/>
-              </w:tabs>
-              <w:cnfStyle w:val="000000100000" w:firstRow="0" w:lastRow="0" w:firstColumn="0" w:lastColumn="0" w:oddVBand="0" w:evenVBand="0" w:oddHBand="1" w:evenHBand="0" w:firstRowFirstColumn="0" w:firstRowLastColumn="0" w:lastRowFirstColumn="0" w:lastRowLastColumn="0"/>
-              <w:rPr>
-                <w:b/>
-                <w:bCs/>
-                <w:sz w:val="24"/>
-                <w:szCs w:val="24"/>
-              </w:rPr>
-            </w:pPr>
-            <w:r>
-              <w:rPr>
-                <w:sz w:val="24"/>
-                <w:szCs w:val="24"/>
-              </w:rPr>
-              <w:t xml:space="preserve">PHP </w:t>
-            </w:r>
-            <w:r>
-              <w:rPr>
-                <w:sz w:val="24"/>
-                <w:szCs w:val="24"/>
-              </w:rPr>
-              <w:t>8.2.12</w:t>
-            </w:r>
-          </w:p>
-        </w:tc>
-      </w:tr>
-      <w:tr>
-        <w:tc>
-          <w:tcPr>
-            <w:cnfStyle w:val="001000000000" w:firstRow="0" w:lastRow="0" w:firstColumn="1" w:lastColumn="0" w:oddVBand="0" w:evenVBand="0" w:oddHBand="0" w:evenHBand="0" w:firstRowFirstColumn="0" w:firstRowLastColumn="0" w:lastRowFirstColumn="0" w:lastRowLastColumn="0"/>
-            <w:tcW w:w="2942" w:type="dxa"/>
-          </w:tcPr>
-          <w:p>
-            <w:pPr>
-              <w:tabs>
-                <w:tab w:val="left" w:pos="990"/>
-              </w:tabs>
+            </w:pPr>
+            <w:r>
               <w:rPr>
                 <w:b w:val="0"/>
                 <w:bCs w:val="0"/>
                 <w:sz w:val="24"/>
                 <w:szCs w:val="24"/>
               </w:rPr>
-            </w:pPr>
-            <w:r>
-              <w:rPr>
-                <w:b w:val="0"/>
-                <w:bCs w:val="0"/>
-                <w:sz w:val="24"/>
-                <w:szCs w:val="24"/>
-              </w:rPr>
               <w:t>CSS Framework</w:t>
             </w:r>
           </w:p>
@@ -3215,21 +2942,12 @@
                 <w:szCs w:val="24"/>
               </w:rPr>
             </w:pPr>
-            <w:proofErr w:type="spellStart"/>
-            <w:r>
-              <w:rPr>
-                <w:sz w:val="24"/>
-                <w:szCs w:val="24"/>
-              </w:rPr>
-              <w:t>Boostrap</w:t>
-            </w:r>
-            <w:proofErr w:type="spellEnd"/>
-            <w:r>
-              <w:rPr>
-                <w:sz w:val="24"/>
-                <w:szCs w:val="24"/>
-              </w:rPr>
-              <w:t xml:space="preserve"> 4</w:t>
+            <w:r>
+              <w:rPr>
+                <w:sz w:val="24"/>
+                <w:szCs w:val="24"/>
+              </w:rPr>
+              <w:t>Boostrap 4</w:t>
             </w:r>
           </w:p>
         </w:tc>
@@ -3334,17 +3052,8 @@
                 <w:sz w:val="24"/>
                 <w:szCs w:val="24"/>
               </w:rPr>
-              <w:t xml:space="preserve">JWT / </w:t>
-            </w:r>
-            <w:proofErr w:type="spellStart"/>
-            <w:r>
-              <w:rPr>
-                <w:sz w:val="24"/>
-                <w:szCs w:val="24"/>
-              </w:rPr>
-              <w:t>Sanctum</w:t>
-            </w:r>
-            <w:proofErr w:type="spellEnd"/>
+              <w:t>JWT / Sanctum</w:t>
+            </w:r>
           </w:p>
         </w:tc>
       </w:tr>
@@ -3447,7 +3156,6 @@
                 <w:szCs w:val="24"/>
               </w:rPr>
             </w:pPr>
-            <w:proofErr w:type="spellStart"/>
             <w:r>
               <w:rPr>
                 <w:b w:val="0"/>
@@ -3457,7 +3165,6 @@
               </w:rPr>
               <w:t>Deploy</w:t>
             </w:r>
-            <w:proofErr w:type="spellEnd"/>
           </w:p>
         </w:tc>
         <w:tc>
@@ -3681,15 +3388,7 @@
           <w:sz w:val="24"/>
           <w:szCs w:val="24"/>
         </w:rPr>
-        <w:t xml:space="preserve">Durante la migración, la base de datos será optimizada y reorganizada para mejorar el rendimiento, reducir información repetida y fortalecer las relaciones entre tablas. </w:t>
-      </w:r>
-      <w:r>
-        <w:rPr>
-          <w:sz w:val="24"/>
-          <w:szCs w:val="24"/>
-        </w:rPr>
-        <w:lastRenderedPageBreak/>
-        <w:t>Esto permitirá un sistema más escalable, ordenado y fácil de mantener e integrar con nuevas funcionalidades en el futuro.</w:t>
+        <w:t>Durante la migración, la base de datos será optimizada y reorganizada para mejorar el rendimiento, reducir información repetida y fortalecer las relaciones entre tablas. Esto permitirá un sistema más escalable, ordenado y fácil de mantener e integrar con nuevas funcionalidades en el futuro.</w:t>
       </w:r>
     </w:p>
     <w:p>
@@ -3698,6 +3397,17 @@
           <w:tab w:val="left" w:pos="990"/>
         </w:tabs>
         <w:rPr>
+          <w:sz w:val="24"/>
+          <w:szCs w:val="24"/>
+        </w:rPr>
+      </w:pPr>
+    </w:p>
+    <w:p>
+      <w:pPr>
+        <w:tabs>
+          <w:tab w:val="left" w:pos="990"/>
+        </w:tabs>
+        <w:rPr>
           <w:b/>
           <w:bCs/>
           <w:sz w:val="24"/>
@@ -3711,7 +3421,8 @@
           <w:sz w:val="24"/>
           <w:szCs w:val="24"/>
         </w:rPr>
-        <w:t>Tabla: us</w:t>
+        <w:lastRenderedPageBreak/>
+        <w:t xml:space="preserve">Tabla: </w:t>
       </w:r>
       <w:r>
         <w:rPr>
@@ -3720,7 +3431,16 @@
           <w:sz w:val="24"/>
           <w:szCs w:val="24"/>
         </w:rPr>
-        <w:t>uarios:</w:t>
+        <w:t>Users</w:t>
+      </w:r>
+      <w:r>
+        <w:rPr>
+          <w:b/>
+          <w:bCs/>
+          <w:sz w:val="24"/>
+          <w:szCs w:val="24"/>
+        </w:rPr>
+        <w:t>:</w:t>
       </w:r>
     </w:p>
     <w:tbl>
@@ -4354,7 +4074,25 @@
           <w:sz w:val="24"/>
           <w:szCs w:val="24"/>
         </w:rPr>
-        <w:t xml:space="preserve">Tabla Orden: </w:t>
+        <w:t>Tabla Orde</w:t>
+      </w:r>
+      <w:r>
+        <w:rPr>
+          <w:b/>
+          <w:bCs/>
+          <w:sz w:val="24"/>
+          <w:szCs w:val="24"/>
+        </w:rPr>
+        <w:t>r</w:t>
+      </w:r>
+      <w:r>
+        <w:rPr>
+          <w:b/>
+          <w:bCs/>
+          <w:sz w:val="24"/>
+          <w:szCs w:val="24"/>
+        </w:rPr>
+        <w:t xml:space="preserve">: </w:t>
       </w:r>
     </w:p>
     <w:tbl>
@@ -4563,7 +4301,14 @@
                 <w:sz w:val="24"/>
                 <w:szCs w:val="24"/>
               </w:rPr>
-              <w:t>id_maquina</w:t>
+              <w:t>id_</w:t>
+            </w:r>
+            <w:r>
+              <w:rPr>
+                <w:sz w:val="24"/>
+                <w:szCs w:val="24"/>
+              </w:rPr>
+              <w:t>machine</w:t>
             </w:r>
           </w:p>
         </w:tc>
@@ -4634,14 +4379,7 @@
                 <w:sz w:val="24"/>
                 <w:szCs w:val="24"/>
               </w:rPr>
-              <w:t>id_departament</w:t>
-            </w:r>
-            <w:r>
-              <w:rPr>
-                <w:sz w:val="24"/>
-                <w:szCs w:val="24"/>
-              </w:rPr>
-              <w:t xml:space="preserve"> </w:t>
+              <w:t xml:space="preserve">id_departament </w:t>
             </w:r>
           </w:p>
         </w:tc>
@@ -4996,23 +4734,7 @@
                 <w:sz w:val="24"/>
                 <w:szCs w:val="24"/>
               </w:rPr>
-              <w:t>id_</w:t>
-            </w:r>
-            <w:proofErr w:type="gramStart"/>
-            <w:r>
-              <w:rPr>
-                <w:sz w:val="24"/>
-                <w:szCs w:val="24"/>
-              </w:rPr>
-              <w:t>status</w:t>
-            </w:r>
-            <w:proofErr w:type="gramEnd"/>
-            <w:r>
-              <w:rPr>
-                <w:sz w:val="24"/>
-                <w:szCs w:val="24"/>
-              </w:rPr>
-              <w:t>_order</w:t>
+              <w:t>id_status_order</w:t>
             </w:r>
           </w:p>
         </w:tc>
@@ -5642,7 +5364,7 @@
           <w:sz w:val="24"/>
           <w:szCs w:val="24"/>
         </w:rPr>
-        <w:t xml:space="preserve">Tabla: </w:t>
+        <w:t>Tabla: orde</w:t>
       </w:r>
       <w:r>
         <w:rPr>
@@ -5651,7 +5373,25 @@
           <w:sz w:val="24"/>
           <w:szCs w:val="24"/>
         </w:rPr>
-        <w:t>orden asignación</w:t>
+        <w:t>r</w:t>
+      </w:r>
+      <w:r>
+        <w:rPr>
+          <w:b/>
+          <w:bCs/>
+          <w:sz w:val="24"/>
+          <w:szCs w:val="24"/>
+        </w:rPr>
+        <w:t xml:space="preserve"> </w:t>
+      </w:r>
+      <w:r>
+        <w:rPr>
+          <w:b/>
+          <w:bCs/>
+          <w:sz w:val="24"/>
+          <w:szCs w:val="24"/>
+        </w:rPr>
+        <w:t>assigment</w:t>
       </w:r>
       <w:r>
         <w:rPr>
@@ -6183,17 +5923,8 @@
                 <w:sz w:val="24"/>
                 <w:szCs w:val="24"/>
               </w:rPr>
-              <w:t>id_</w:t>
-            </w:r>
-            <w:proofErr w:type="gramStart"/>
-            <w:r>
-              <w:rPr>
-                <w:sz w:val="24"/>
-                <w:szCs w:val="24"/>
-              </w:rPr>
-              <w:t>status</w:t>
-            </w:r>
-            <w:proofErr w:type="gramEnd"/>
+              <w:t>id_status</w:t>
+            </w:r>
           </w:p>
         </w:tc>
         <w:tc>
@@ -6294,6 +6025,32 @@
         </w:tc>
       </w:tr>
     </w:tbl>
+    <w:p>
+      <w:pPr>
+        <w:tabs>
+          <w:tab w:val="left" w:pos="990"/>
+        </w:tabs>
+        <w:rPr>
+          <w:b/>
+          <w:bCs/>
+          <w:sz w:val="24"/>
+          <w:szCs w:val="24"/>
+        </w:rPr>
+      </w:pPr>
+    </w:p>
+    <w:p>
+      <w:pPr>
+        <w:tabs>
+          <w:tab w:val="left" w:pos="990"/>
+        </w:tabs>
+        <w:rPr>
+          <w:b/>
+          <w:bCs/>
+          <w:sz w:val="24"/>
+          <w:szCs w:val="24"/>
+        </w:rPr>
+      </w:pPr>
+    </w:p>
     <w:p>
       <w:pPr>
         <w:tabs>
@@ -6523,14 +6280,7 @@
                 <w:sz w:val="24"/>
                 <w:szCs w:val="24"/>
               </w:rPr>
-              <w:t>id_</w:t>
-            </w:r>
-            <w:r>
-              <w:rPr>
-                <w:sz w:val="24"/>
-                <w:szCs w:val="24"/>
-              </w:rPr>
-              <w:t>orde</w:t>
+              <w:t>id_orde</w:t>
             </w:r>
             <w:r>
               <w:rPr>
@@ -6764,14 +6514,7 @@
                 <w:sz w:val="24"/>
                 <w:szCs w:val="24"/>
               </w:rPr>
-              <w:t>id_</w:t>
-            </w:r>
-            <w:r>
-              <w:rPr>
-                <w:sz w:val="24"/>
-                <w:szCs w:val="24"/>
-              </w:rPr>
-              <w:t>coin</w:t>
+              <w:t>id_coin</w:t>
             </w:r>
           </w:p>
         </w:tc>
@@ -7251,21 +6994,7 @@
                 <w:sz w:val="24"/>
                 <w:szCs w:val="24"/>
               </w:rPr>
-              <w:t xml:space="preserve"> </w:t>
-            </w:r>
-            <w:r>
-              <w:rPr>
-                <w:sz w:val="24"/>
-                <w:szCs w:val="24"/>
-              </w:rPr>
-              <w:t>status</w:t>
-            </w:r>
-            <w:r>
-              <w:rPr>
-                <w:sz w:val="24"/>
-                <w:szCs w:val="24"/>
-              </w:rPr>
-              <w:t xml:space="preserve"> </w:t>
+              <w:t xml:space="preserve"> status </w:t>
             </w:r>
             <w:r>
               <w:rPr>
@@ -7345,21 +7074,12 @@
                 <w:szCs w:val="24"/>
               </w:rPr>
             </w:pPr>
-            <w:proofErr w:type="gramStart"/>
-            <w:r>
-              <w:rPr>
-                <w:sz w:val="24"/>
-                <w:szCs w:val="24"/>
-              </w:rPr>
-              <w:t>status</w:t>
-            </w:r>
-            <w:proofErr w:type="gramEnd"/>
-            <w:r>
-              <w:rPr>
-                <w:sz w:val="24"/>
-                <w:szCs w:val="24"/>
-              </w:rPr>
-              <w:t>_name</w:t>
+            <w:r>
+              <w:rPr>
+                <w:sz w:val="24"/>
+                <w:szCs w:val="24"/>
+              </w:rPr>
+              <w:t>status_name</w:t>
             </w:r>
           </w:p>
         </w:tc>
@@ -7430,14 +7150,7 @@
                 <w:sz w:val="24"/>
                 <w:szCs w:val="24"/>
               </w:rPr>
-              <w:t>color</w:t>
-            </w:r>
-            <w:r>
-              <w:rPr>
-                <w:sz w:val="24"/>
-                <w:szCs w:val="24"/>
-              </w:rPr>
-              <w:t xml:space="preserve"> </w:t>
+              <w:t xml:space="preserve">color </w:t>
             </w:r>
           </w:p>
         </w:tc>
@@ -7503,7 +7216,6 @@
                 <w:szCs w:val="24"/>
               </w:rPr>
             </w:pPr>
-            <w:proofErr w:type="gramStart"/>
             <w:r>
               <w:rPr>
                 <w:sz w:val="24"/>
@@ -7511,7 +7223,6 @@
               </w:rPr>
               <w:t>status</w:t>
             </w:r>
-            <w:proofErr w:type="gramEnd"/>
           </w:p>
         </w:tc>
         <w:tc>
@@ -7882,7 +7593,6 @@
               </w:rPr>
               <w:t>id_</w:t>
             </w:r>
-            <w:proofErr w:type="gramStart"/>
             <w:r>
               <w:rPr>
                 <w:sz w:val="24"/>
@@ -7890,7 +7600,6 @@
               </w:rPr>
               <w:t>status</w:t>
             </w:r>
-            <w:proofErr w:type="gramEnd"/>
             <w:r>
               <w:rPr>
                 <w:sz w:val="24"/>
@@ -9329,14 +9038,7 @@
                 <w:sz w:val="24"/>
                 <w:szCs w:val="24"/>
               </w:rPr>
-              <w:t>id_</w:t>
-            </w:r>
-            <w:r>
-              <w:rPr>
-                <w:sz w:val="24"/>
-                <w:szCs w:val="24"/>
-              </w:rPr>
-              <w:t>priority</w:t>
+              <w:t>id_priority</w:t>
             </w:r>
           </w:p>
         </w:tc>
@@ -10276,14 +9978,7 @@
                 <w:sz w:val="24"/>
                 <w:szCs w:val="24"/>
               </w:rPr>
-              <w:t>id_</w:t>
-            </w:r>
-            <w:r>
-              <w:rPr>
-                <w:sz w:val="24"/>
-                <w:szCs w:val="24"/>
-              </w:rPr>
-              <w:t>type_maintances</w:t>
+              <w:t>id_type_maintances</w:t>
             </w:r>
           </w:p>
         </w:tc>
@@ -10666,19 +10361,8 @@
           <w:sz w:val="24"/>
           <w:szCs w:val="24"/>
         </w:rPr>
-        <w:t xml:space="preserve">Tabla: </w:t>
+        <w:t>Tabla: type_machines</w:t>
       </w:r>
-      <w:proofErr w:type="spellStart"/>
-      <w:r>
-        <w:rPr>
-          <w:b/>
-          <w:bCs/>
-          <w:sz w:val="24"/>
-          <w:szCs w:val="24"/>
-        </w:rPr>
-        <w:t>type_machines</w:t>
-      </w:r>
-      <w:proofErr w:type="spellEnd"/>
       <w:r>
         <w:rPr>
           <w:b/>
@@ -10796,14 +10480,7 @@
                 <w:sz w:val="24"/>
                 <w:szCs w:val="24"/>
               </w:rPr>
-              <w:t>id_type_</w:t>
-            </w:r>
-            <w:r>
-              <w:rPr>
-                <w:sz w:val="24"/>
-                <w:szCs w:val="24"/>
-              </w:rPr>
-              <w:t>machines</w:t>
+              <w:t>id_type_machines</w:t>
             </w:r>
           </w:p>
         </w:tc>
@@ -11013,14 +10690,7 @@
                 <w:sz w:val="24"/>
                 <w:szCs w:val="24"/>
               </w:rPr>
-              <w:t xml:space="preserve">Descripción </w:t>
-            </w:r>
-            <w:r>
-              <w:rPr>
-                <w:sz w:val="24"/>
-                <w:szCs w:val="24"/>
-              </w:rPr>
-              <w:t>de la máquina</w:t>
+              <w:t>Descripción de la máquina</w:t>
             </w:r>
           </w:p>
         </w:tc>
@@ -11186,22 +10856,13 @@
                 <w:szCs w:val="24"/>
               </w:rPr>
             </w:pPr>
-            <w:proofErr w:type="spellStart"/>
-            <w:r>
-              <w:rPr>
-                <w:sz w:val="24"/>
-                <w:szCs w:val="24"/>
-              </w:rPr>
-              <w:t>id_type_</w:t>
-            </w:r>
-            <w:r>
-              <w:rPr>
-                <w:sz w:val="24"/>
-                <w:szCs w:val="24"/>
-              </w:rPr>
-              <w:t>failures</w:t>
-            </w:r>
-            <w:proofErr w:type="spellEnd"/>
+            <w:r>
+              <w:rPr>
+                <w:sz w:val="24"/>
+                <w:szCs w:val="24"/>
+              </w:rPr>
+              <w:t>id_type_failures</w:t>
+            </w:r>
           </w:p>
         </w:tc>
         <w:tc>
@@ -11254,14 +10915,7 @@
                 <w:sz w:val="24"/>
                 <w:szCs w:val="24"/>
               </w:rPr>
-              <w:t xml:space="preserve">tipo de </w:t>
-            </w:r>
-            <w:r>
-              <w:rPr>
-                <w:sz w:val="24"/>
-                <w:szCs w:val="24"/>
-              </w:rPr>
-              <w:t>falla</w:t>
+              <w:t>tipo de falla</w:t>
             </w:r>
           </w:p>
         </w:tc>
@@ -11507,6 +11161,651 @@
           <w:szCs w:val="24"/>
         </w:rPr>
       </w:pPr>
+    </w:p>
+    <w:p>
+      <w:pPr>
+        <w:tabs>
+          <w:tab w:val="left" w:pos="990"/>
+        </w:tabs>
+        <w:rPr>
+          <w:b/>
+          <w:bCs/>
+          <w:sz w:val="24"/>
+          <w:szCs w:val="24"/>
+        </w:rPr>
+      </w:pPr>
+    </w:p>
+    <w:p>
+      <w:pPr>
+        <w:tabs>
+          <w:tab w:val="left" w:pos="990"/>
+        </w:tabs>
+        <w:rPr>
+          <w:b/>
+          <w:bCs/>
+          <w:sz w:val="24"/>
+          <w:szCs w:val="24"/>
+        </w:rPr>
+      </w:pPr>
+      <w:r>
+        <w:rPr>
+          <w:b/>
+          <w:bCs/>
+          <w:sz w:val="24"/>
+          <w:szCs w:val="24"/>
+        </w:rPr>
+        <w:t>PascalCase,</w:t>
+      </w:r>
+      <w:r>
+        <w:rPr>
+          <w:b/>
+          <w:bCs/>
+          <w:sz w:val="24"/>
+          <w:szCs w:val="24"/>
+        </w:rPr>
+        <w:t xml:space="preserve"> para modelos en laravel </w:t>
+      </w:r>
+    </w:p>
+    <w:p>
+      <w:pPr>
+        <w:tabs>
+          <w:tab w:val="left" w:pos="990"/>
+        </w:tabs>
+        <w:rPr>
+          <w:b/>
+          <w:bCs/>
+          <w:sz w:val="24"/>
+          <w:szCs w:val="24"/>
+        </w:rPr>
+      </w:pPr>
+    </w:p>
+    <w:p>
+      <w:pPr>
+        <w:tabs>
+          <w:tab w:val="left" w:pos="990"/>
+        </w:tabs>
+        <w:rPr>
+          <w:b/>
+          <w:bCs/>
+          <w:sz w:val="24"/>
+          <w:szCs w:val="24"/>
+        </w:rPr>
+      </w:pPr>
+      <w:r>
+        <w:rPr>
+          <w:b/>
+          <w:bCs/>
+          <w:sz w:val="24"/>
+          <w:szCs w:val="24"/>
+        </w:rPr>
+        <w:t xml:space="preserve">snake_case se </w:t>
+      </w:r>
+      <w:r>
+        <w:rPr>
+          <w:b/>
+          <w:bCs/>
+          <w:sz w:val="24"/>
+          <w:szCs w:val="24"/>
+        </w:rPr>
+        <w:t>ocupará</w:t>
+      </w:r>
+      <w:r>
+        <w:rPr>
+          <w:b/>
+          <w:bCs/>
+          <w:sz w:val="24"/>
+          <w:szCs w:val="24"/>
+        </w:rPr>
+        <w:t xml:space="preserve"> en toda la base de datos y lo que tenga que ver con código</w:t>
+      </w:r>
+    </w:p>
+    <w:p>
+      <w:pPr>
+        <w:tabs>
+          <w:tab w:val="left" w:pos="990"/>
+        </w:tabs>
+        <w:rPr>
+          <w:b/>
+          <w:bCs/>
+          <w:sz w:val="24"/>
+          <w:szCs w:val="24"/>
+        </w:rPr>
+      </w:pPr>
+      <w:r>
+        <w:rPr>
+          <w:b/>
+          <w:bCs/>
+          <w:sz w:val="24"/>
+          <w:szCs w:val="24"/>
+        </w:rPr>
+        <w:t>snake_case, ejemplo:</w:t>
+      </w:r>
+    </w:p>
+    <w:p>
+      <w:pPr>
+        <w:tabs>
+          <w:tab w:val="left" w:pos="990"/>
+        </w:tabs>
+        <w:rPr>
+          <w:b/>
+          <w:bCs/>
+          <w:sz w:val="24"/>
+          <w:szCs w:val="24"/>
+        </w:rPr>
+      </w:pPr>
+      <w:r>
+        <w:rPr>
+          <w:b/>
+          <w:bCs/>
+          <w:sz w:val="24"/>
+          <w:szCs w:val="24"/>
+        </w:rPr>
+        <w:t>asi_se_escribe_usando_snake_case</w:t>
+      </w:r>
+    </w:p>
+    <w:p>
+      <w:pPr>
+        <w:tabs>
+          <w:tab w:val="left" w:pos="990"/>
+        </w:tabs>
+        <w:rPr>
+          <w:b/>
+          <w:bCs/>
+          <w:sz w:val="24"/>
+          <w:szCs w:val="24"/>
+        </w:rPr>
+      </w:pPr>
+      <w:r>
+        <w:rPr>
+          <w:b/>
+          <w:bCs/>
+          <w:sz w:val="24"/>
+          <w:szCs w:val="24"/>
+        </w:rPr>
+        <w:t>tbl_users</w:t>
+      </w:r>
+    </w:p>
+    <w:p>
+      <w:pPr>
+        <w:tabs>
+          <w:tab w:val="left" w:pos="990"/>
+        </w:tabs>
+        <w:rPr>
+          <w:b/>
+          <w:bCs/>
+          <w:sz w:val="24"/>
+          <w:szCs w:val="24"/>
+        </w:rPr>
+      </w:pPr>
+      <w:r>
+        <w:rPr>
+          <w:b/>
+          <w:bCs/>
+          <w:sz w:val="24"/>
+          <w:szCs w:val="24"/>
+        </w:rPr>
+        <w:t>cat_areas</w:t>
+      </w:r>
+    </w:p>
+    <w:p>
+      <w:pPr>
+        <w:tabs>
+          <w:tab w:val="left" w:pos="990"/>
+        </w:tabs>
+        <w:rPr>
+          <w:b/>
+          <w:bCs/>
+          <w:sz w:val="24"/>
+          <w:szCs w:val="24"/>
+        </w:rPr>
+      </w:pPr>
+      <w:r>
+        <w:rPr>
+          <w:b/>
+          <w:bCs/>
+          <w:sz w:val="24"/>
+          <w:szCs w:val="24"/>
+        </w:rPr>
+        <w:t>PascalCase, ejemplo:</w:t>
+      </w:r>
+    </w:p>
+    <w:p>
+      <w:pPr>
+        <w:tabs>
+          <w:tab w:val="left" w:pos="990"/>
+        </w:tabs>
+        <w:rPr>
+          <w:b/>
+          <w:bCs/>
+          <w:sz w:val="24"/>
+          <w:szCs w:val="24"/>
+        </w:rPr>
+      </w:pPr>
+      <w:r>
+        <w:rPr>
+          <w:b/>
+          <w:bCs/>
+          <w:sz w:val="24"/>
+          <w:szCs w:val="24"/>
+        </w:rPr>
+        <w:t>AsiSeEscribeEnPascalCase</w:t>
+      </w:r>
+    </w:p>
+    <w:p>
+      <w:pPr>
+        <w:tabs>
+          <w:tab w:val="left" w:pos="990"/>
+        </w:tabs>
+        <w:rPr>
+          <w:b/>
+          <w:bCs/>
+          <w:sz w:val="24"/>
+          <w:szCs w:val="24"/>
+        </w:rPr>
+      </w:pPr>
+    </w:p>
+    <w:p>
+      <w:pPr>
+        <w:tabs>
+          <w:tab w:val="left" w:pos="990"/>
+        </w:tabs>
+        <w:rPr>
+          <w:b/>
+          <w:bCs/>
+          <w:sz w:val="24"/>
+          <w:szCs w:val="24"/>
+        </w:rPr>
+      </w:pPr>
+      <w:r>
+        <w:rPr>
+          <w:b/>
+          <w:bCs/>
+          <w:sz w:val="24"/>
+          <w:szCs w:val="24"/>
+        </w:rPr>
+        <w:t xml:space="preserve">Comandos para crear un model: </w:t>
+      </w:r>
+      <w:r>
+        <w:rPr>
+          <w:b/>
+          <w:bCs/>
+          <w:sz w:val="24"/>
+          <w:szCs w:val="24"/>
+        </w:rPr>
+        <w:t>php artisan make:model CatDepartament</w:t>
+      </w:r>
+    </w:p>
+    <w:p>
+      <w:pPr>
+        <w:tabs>
+          <w:tab w:val="left" w:pos="990"/>
+        </w:tabs>
+        <w:rPr>
+          <w:b/>
+          <w:bCs/>
+          <w:sz w:val="24"/>
+          <w:szCs w:val="24"/>
+        </w:rPr>
+      </w:pPr>
+      <w:r>
+        <w:rPr>
+          <w:b/>
+          <w:bCs/>
+          <w:sz w:val="24"/>
+          <w:szCs w:val="24"/>
+        </w:rPr>
+        <w:t xml:space="preserve">Comandos para crear controller: </w:t>
+      </w:r>
+      <w:r>
+        <w:rPr>
+          <w:b/>
+          <w:bCs/>
+          <w:sz w:val="24"/>
+          <w:szCs w:val="24"/>
+        </w:rPr>
+        <w:t>php artisan make:controller Admin/Catalogos/DepartamentsController</w:t>
+      </w:r>
+      <w:r>
+        <w:rPr>
+          <w:b/>
+          <w:bCs/>
+          <w:sz w:val="24"/>
+          <w:szCs w:val="24"/>
+        </w:rPr>
+        <w:t xml:space="preserve"> </w:t>
+      </w:r>
+    </w:p>
+    <w:p>
+      <w:pPr>
+        <w:tabs>
+          <w:tab w:val="left" w:pos="990"/>
+        </w:tabs>
+        <w:rPr>
+          <w:b/>
+          <w:bCs/>
+          <w:sz w:val="24"/>
+          <w:szCs w:val="24"/>
+        </w:rPr>
+      </w:pPr>
+      <w:r>
+        <w:rPr>
+          <w:b/>
+          <w:bCs/>
+          <w:sz w:val="24"/>
+          <w:szCs w:val="24"/>
+        </w:rPr>
+        <w:t xml:space="preserve">Comandos para crear repository: </w:t>
+      </w:r>
+      <w:r>
+        <w:rPr>
+          <w:b/>
+          <w:bCs/>
+          <w:sz w:val="24"/>
+          <w:szCs w:val="24"/>
+        </w:rPr>
+        <w:t>php artisan make:repository Admin/Catalogos/DepartamentsRepository</w:t>
+      </w:r>
+    </w:p>
+    <w:p>
+      <w:pPr>
+        <w:tabs>
+          <w:tab w:val="left" w:pos="990"/>
+        </w:tabs>
+        <w:rPr>
+          <w:b/>
+          <w:bCs/>
+          <w:sz w:val="24"/>
+          <w:szCs w:val="24"/>
+        </w:rPr>
+      </w:pPr>
+      <w:r>
+        <w:rPr>
+          <w:b/>
+          <w:bCs/>
+          <w:sz w:val="24"/>
+          <w:szCs w:val="24"/>
+        </w:rPr>
+        <w:t xml:space="preserve">Comandos para crear service: </w:t>
+      </w:r>
+      <w:r>
+        <w:rPr>
+          <w:b/>
+          <w:bCs/>
+          <w:sz w:val="24"/>
+          <w:szCs w:val="24"/>
+        </w:rPr>
+        <w:t xml:space="preserve">php artisan make:service Admin/Catalogos/DepartamentsService  </w:t>
+      </w:r>
+    </w:p>
+    <w:p>
+      <w:pPr>
+        <w:tabs>
+          <w:tab w:val="left" w:pos="990"/>
+        </w:tabs>
+        <w:rPr>
+          <w:b/>
+          <w:bCs/>
+          <w:sz w:val="24"/>
+          <w:szCs w:val="24"/>
+        </w:rPr>
+      </w:pPr>
+    </w:p>
+    <w:p>
+      <w:pPr>
+        <w:tabs>
+          <w:tab w:val="left" w:pos="990"/>
+        </w:tabs>
+        <w:rPr>
+          <w:b/>
+          <w:bCs/>
+          <w:sz w:val="24"/>
+          <w:szCs w:val="24"/>
+        </w:rPr>
+      </w:pPr>
+    </w:p>
+    <w:p>
+      <w:pPr>
+        <w:tabs>
+          <w:tab w:val="left" w:pos="990"/>
+        </w:tabs>
+        <w:rPr>
+          <w:b/>
+          <w:bCs/>
+          <w:sz w:val="24"/>
+          <w:szCs w:val="24"/>
+        </w:rPr>
+      </w:pPr>
+    </w:p>
+    <w:p>
+      <w:pPr>
+        <w:tabs>
+          <w:tab w:val="left" w:pos="990"/>
+        </w:tabs>
+        <w:rPr>
+          <w:b/>
+          <w:bCs/>
+          <w:sz w:val="24"/>
+          <w:szCs w:val="24"/>
+        </w:rPr>
+      </w:pPr>
+    </w:p>
+    <w:p>
+      <w:pPr>
+        <w:tabs>
+          <w:tab w:val="left" w:pos="990"/>
+        </w:tabs>
+        <w:rPr>
+          <w:b/>
+          <w:bCs/>
+          <w:sz w:val="24"/>
+          <w:szCs w:val="24"/>
+        </w:rPr>
+      </w:pPr>
+      <w:r>
+        <w:rPr>
+          <w:b/>
+          <w:bCs/>
+          <w:sz w:val="24"/>
+          <w:szCs w:val="24"/>
+        </w:rPr>
+        <w:lastRenderedPageBreak/>
+        <w:t xml:space="preserve">Comando para crear service en angular: </w:t>
+      </w:r>
+    </w:p>
+    <w:p>
+      <w:pPr>
+        <w:tabs>
+          <w:tab w:val="left" w:pos="990"/>
+        </w:tabs>
+        <w:rPr>
+          <w:b/>
+          <w:bCs/>
+          <w:sz w:val="24"/>
+          <w:szCs w:val="24"/>
+        </w:rPr>
+      </w:pPr>
+      <w:r>
+        <w:rPr>
+          <w:b/>
+          <w:bCs/>
+          <w:sz w:val="24"/>
+          <w:szCs w:val="24"/>
+        </w:rPr>
+        <w:t>ng g s admin/services/api/tipomANTENIMIENTO/tipoMantenimiento</w:t>
+      </w:r>
+    </w:p>
+    <w:p>
+      <w:pPr>
+        <w:tabs>
+          <w:tab w:val="left" w:pos="990"/>
+        </w:tabs>
+        <w:rPr>
+          <w:b/>
+          <w:bCs/>
+          <w:sz w:val="24"/>
+          <w:szCs w:val="24"/>
+        </w:rPr>
+      </w:pPr>
+    </w:p>
+    <w:p>
+      <w:pPr>
+        <w:tabs>
+          <w:tab w:val="left" w:pos="990"/>
+        </w:tabs>
+        <w:rPr>
+          <w:b/>
+          <w:bCs/>
+          <w:sz w:val="24"/>
+          <w:szCs w:val="24"/>
+        </w:rPr>
+      </w:pPr>
+      <w:r>
+        <w:rPr>
+          <w:b/>
+          <w:bCs/>
+          <w:sz w:val="24"/>
+          <w:szCs w:val="24"/>
+        </w:rPr>
+        <w:t xml:space="preserve">Comando para crear módulos: </w:t>
+      </w:r>
+    </w:p>
+    <w:p>
+      <w:pPr>
+        <w:tabs>
+          <w:tab w:val="left" w:pos="990"/>
+        </w:tabs>
+        <w:rPr>
+          <w:b/>
+          <w:bCs/>
+          <w:sz w:val="24"/>
+          <w:szCs w:val="24"/>
+        </w:rPr>
+      </w:pPr>
+      <w:r>
+        <w:rPr>
+          <w:b/>
+          <w:bCs/>
+          <w:sz w:val="24"/>
+          <w:szCs w:val="24"/>
+        </w:rPr>
+        <w:t>ng g c admin/modules/catalogos/tipo-</w:t>
+      </w:r>
+      <w:r>
+        <w:rPr>
+          <w:b/>
+          <w:bCs/>
+          <w:sz w:val="24"/>
+          <w:szCs w:val="24"/>
+        </w:rPr>
+        <w:t>orden</w:t>
+      </w:r>
+      <w:r>
+        <w:rPr>
+          <w:b/>
+          <w:bCs/>
+          <w:sz w:val="24"/>
+          <w:szCs w:val="24"/>
+        </w:rPr>
+        <w:t>/consulta-tipo-</w:t>
+      </w:r>
+      <w:r>
+        <w:rPr>
+          <w:b/>
+          <w:bCs/>
+          <w:sz w:val="24"/>
+          <w:szCs w:val="24"/>
+        </w:rPr>
+        <w:t>Orden</w:t>
+      </w:r>
+    </w:p>
+    <w:p>
+      <w:pPr>
+        <w:tabs>
+          <w:tab w:val="left" w:pos="990"/>
+        </w:tabs>
+        <w:rPr>
+          <w:b/>
+          <w:bCs/>
+          <w:sz w:val="24"/>
+          <w:szCs w:val="24"/>
+        </w:rPr>
+      </w:pPr>
+    </w:p>
+    <w:p>
+      <w:pPr>
+        <w:tabs>
+          <w:tab w:val="left" w:pos="990"/>
+        </w:tabs>
+        <w:rPr>
+          <w:b/>
+          <w:bCs/>
+          <w:sz w:val="24"/>
+          <w:szCs w:val="24"/>
+        </w:rPr>
+      </w:pPr>
+      <w:r>
+        <w:rPr>
+          <w:b/>
+          <w:bCs/>
+          <w:sz w:val="24"/>
+          <w:szCs w:val="24"/>
+        </w:rPr>
+        <w:t xml:space="preserve">Crear para modulo registro, </w:t>
+      </w:r>
+      <w:r>
+        <w:rPr>
+          <w:b/>
+          <w:bCs/>
+          <w:sz w:val="24"/>
+          <w:szCs w:val="24"/>
+        </w:rPr>
+        <w:t>ng g c admin/modules/catalogos/tipoOrden/registrar-tipoOrden</w:t>
+      </w:r>
+    </w:p>
+    <w:p>
+      <w:pPr>
+        <w:tabs>
+          <w:tab w:val="left" w:pos="990"/>
+        </w:tabs>
+        <w:rPr>
+          <w:b/>
+          <w:bCs/>
+          <w:sz w:val="24"/>
+          <w:szCs w:val="24"/>
+        </w:rPr>
+      </w:pPr>
+    </w:p>
+    <w:p>
+      <w:pPr>
+        <w:tabs>
+          <w:tab w:val="left" w:pos="990"/>
+        </w:tabs>
+        <w:rPr>
+          <w:b/>
+          <w:bCs/>
+          <w:sz w:val="24"/>
+          <w:szCs w:val="24"/>
+        </w:rPr>
+      </w:pPr>
+      <w:r>
+        <w:rPr>
+          <w:b/>
+          <w:bCs/>
+          <w:sz w:val="24"/>
+          <w:szCs w:val="24"/>
+        </w:rPr>
+        <w:t xml:space="preserve">Para crear componentes:  </w:t>
+      </w:r>
+      <w:r>
+        <w:rPr>
+          <w:b/>
+          <w:bCs/>
+          <w:sz w:val="24"/>
+          <w:szCs w:val="24"/>
+          <w:lang w:val="en-US"/>
+        </w:rPr>
+        <w:t>ng g c admin/components/sidenav</w:t>
+      </w:r>
     </w:p>
     <w:sectPr>
       <w:headerReference w:type="default" r:id="rId6"/>
@@ -12243,6 +12542,7 @@
   <w:style w:type="character" w:default="1" w:styleId="Fuentedeprrafopredeter">
     <w:name w:val="Default Paragraph Font"/>
     <w:uiPriority w:val="1"/>
+    <w:semiHidden/>
     <w:unhideWhenUsed/>
   </w:style>
   <w:style w:type="table" w:default="1" w:styleId="Tablanormal">

</xml_diff>